<commit_message>
chore: fix and add UML diagram
</commit_message>
<xml_diff>
--- a/Assignment 1 Report.docx
+++ b/Assignment 1 Report.docx
@@ -169,15 +169,7 @@
           <w:szCs w:val="32"/>
           <w:lang w:val="en-US"/>
         </w:rPr>
-        <w:t xml:space="preserve"> </w:t>
-      </w:r>
-      <w:r>
-        <w:rPr>
-          <w:sz w:val="32"/>
-          <w:szCs w:val="32"/>
-          <w:lang w:val="en-US"/>
-        </w:rPr>
-        <w:t>–</w:t>
+        <w:t xml:space="preserve"> –</w:t>
       </w:r>
       <w:r>
         <w:rPr>
@@ -277,25 +269,7 @@
           <w:szCs w:val="32"/>
           <w:lang w:val="en-US"/>
         </w:rPr>
-        <w:t xml:space="preserve">Yogita </w:t>
-      </w:r>
-      <w:proofErr w:type="spellStart"/>
-      <w:r>
-        <w:rPr>
-          <w:sz w:val="32"/>
-          <w:szCs w:val="32"/>
-          <w:lang w:val="en-US"/>
-        </w:rPr>
-        <w:t>Bamrah</w:t>
-      </w:r>
-      <w:proofErr w:type="spellEnd"/>
-      <w:r>
-        <w:rPr>
-          <w:sz w:val="32"/>
-          <w:szCs w:val="32"/>
-          <w:lang w:val="en-US"/>
-        </w:rPr>
-        <w:t xml:space="preserve"> </w:t>
+        <w:t xml:space="preserve">Yogita Bamrah </w:t>
       </w:r>
       <w:r>
         <w:rPr>
@@ -539,13 +513,7 @@
               <w:rPr>
                 <w:lang w:val="en-US"/>
               </w:rPr>
-              <w:t>C</w:t>
-            </w:r>
-            <w:r>
-              <w:rPr>
-                <w:lang w:val="en-US"/>
-              </w:rPr>
-              <w:t>harge monthly members a monthly membership payment</w:t>
+              <w:t>Charge monthly members a monthly membership payment</w:t>
             </w:r>
           </w:p>
         </w:tc>
@@ -687,21 +655,7 @@
               <w:rPr>
                 <w:lang w:val="en-US"/>
               </w:rPr>
-              <w:t xml:space="preserve">Allow riders to return </w:t>
-            </w:r>
-            <w:proofErr w:type="gramStart"/>
-            <w:r>
-              <w:rPr>
-                <w:lang w:val="en-US"/>
-              </w:rPr>
-              <w:t>vehicle</w:t>
-            </w:r>
-            <w:proofErr w:type="gramEnd"/>
-            <w:r>
-              <w:rPr>
-                <w:lang w:val="en-US"/>
-              </w:rPr>
-              <w:t xml:space="preserve"> to any station with free docking point; verify vehicle is locked; if station is full, redirect to nearest non-full station; keep trip active and charging until vehicle is locked</w:t>
+              <w:t>Allow riders to return vehicle to any station with free docking point; verify vehicle is locked; if station is full, redirect to nearest non-full station; keep trip active and charging until vehicle is locked</w:t>
             </w:r>
             <w:r>
               <w:rPr>
@@ -897,13 +851,7 @@
               <w:rPr>
                 <w:lang w:val="en-US"/>
               </w:rPr>
-              <w:t>Remove broken and low-battery devices from rental pool</w:t>
-            </w:r>
-            <w:r>
-              <w:rPr>
-                <w:lang w:val="en-US"/>
-              </w:rPr>
-              <w:t>; allow control room operators to manipulate fault reports</w:t>
+              <w:t>Remove broken and low-battery devices from rental pool; allow control room operators to manipulate fault reports</w:t>
             </w:r>
           </w:p>
         </w:tc>
@@ -1088,13 +1036,7 @@
           <w:lang w:val="en-US"/>
         </w:rPr>
         <w:lastRenderedPageBreak/>
-        <w:t>Quality</w:t>
-      </w:r>
-      <w:r>
-        <w:rPr>
-          <w:lang w:val="en-US"/>
-        </w:rPr>
-        <w:t xml:space="preserve"> Requirements</w:t>
+        <w:t>Quality Requirements</w:t>
       </w:r>
     </w:p>
     <w:p>
@@ -1109,13 +1051,7 @@
         <w:rPr>
           <w:lang w:val="en-US"/>
         </w:rPr>
-        <w:t xml:space="preserve">These are requirements that </w:t>
-      </w:r>
-      <w:r>
-        <w:rPr>
-          <w:lang w:val="en-US"/>
-        </w:rPr>
-        <w:t>cover usability, accessibility, and pricing.</w:t>
+        <w:t>These are requirements that cover usability, accessibility, and pricing.</w:t>
       </w:r>
     </w:p>
     <w:p>
@@ -1362,13 +1298,7 @@
         <w:rPr>
           <w:lang w:val="en-US"/>
         </w:rPr>
-        <w:t xml:space="preserve">These are </w:t>
-      </w:r>
-      <w:r>
-        <w:rPr>
-          <w:lang w:val="en-US"/>
-        </w:rPr>
-        <w:t xml:space="preserve">the boundaries of the application and the GoCycle </w:t>
+        <w:t xml:space="preserve">These are the boundaries of the application and the GoCycle </w:t>
       </w:r>
       <w:r>
         <w:rPr>
@@ -1725,21 +1655,7 @@
               <w:rPr>
                 <w:lang w:val="en-US"/>
               </w:rPr>
-              <w:t xml:space="preserve">Java, SOLID principles, at least two design patterns, at least eight classes, implementation and design in shared </w:t>
-            </w:r>
-            <w:proofErr w:type="spellStart"/>
-            <w:r>
-              <w:rPr>
-                <w:lang w:val="en-US"/>
-              </w:rPr>
-              <w:t>git</w:t>
-            </w:r>
-            <w:proofErr w:type="spellEnd"/>
-            <w:r>
-              <w:rPr>
-                <w:lang w:val="en-US"/>
-              </w:rPr>
-              <w:t xml:space="preserve"> repo</w:t>
+              <w:t>Java, SOLID principles, at least two design patterns, at least eight classes, implementation and design in shared git repo</w:t>
             </w:r>
           </w:p>
         </w:tc>
@@ -1960,13 +1876,7 @@
               <w:rPr>
                 <w:lang w:val="en-US"/>
               </w:rPr>
-              <w:t xml:space="preserve">$0.50/minute, $0.20/minute, </w:t>
-            </w:r>
-            <w:r>
-              <w:rPr>
-                <w:lang w:val="en-US"/>
-              </w:rPr>
-              <w:t>$0.20/minute</w:t>
+              <w:t>$0.50/minute, $0.20/minute, $0.20/minute</w:t>
             </w:r>
           </w:p>
         </w:tc>
@@ -3748,13 +3658,7 @@
           <w:lang w:val="en-US"/>
         </w:rPr>
         <w:lastRenderedPageBreak/>
-        <w:t xml:space="preserve">GoCycle </w:t>
-      </w:r>
-      <w:r>
-        <w:rPr>
-          <w:lang w:val="en-US"/>
-        </w:rPr>
-        <w:t>Use Case Model</w:t>
+        <w:t>GoCycle Use Case Model</w:t>
       </w:r>
     </w:p>
     <w:p>
@@ -4274,13 +4178,7 @@
         <w:rPr>
           <w:lang w:val="en-US"/>
         </w:rPr>
-        <w:t xml:space="preserve">GoCycle requests a refundable deposit, and </w:t>
-      </w:r>
-      <w:r>
-        <w:rPr>
-          <w:lang w:val="en-US"/>
-        </w:rPr>
-        <w:t>checks that this payment method is valid for the zone</w:t>
+        <w:t>GoCycle requests a refundable deposit, and checks that this payment method is valid for the zone</w:t>
       </w:r>
     </w:p>
     <w:p>
@@ -4440,25 +4338,7 @@
           <w:lang w:val="en-US"/>
         </w:rPr>
         <w:lastRenderedPageBreak/>
-        <w:t xml:space="preserve">Use Case </w:t>
-      </w:r>
-      <w:r>
-        <w:rPr>
-          <w:lang w:val="en-US"/>
-        </w:rPr>
-        <w:t>2</w:t>
-      </w:r>
-      <w:r>
-        <w:rPr>
-          <w:lang w:val="en-US"/>
-        </w:rPr>
-        <w:t xml:space="preserve">: </w:t>
-      </w:r>
-      <w:r>
-        <w:rPr>
-          <w:lang w:val="en-US"/>
-        </w:rPr>
-        <w:t>Return Vehicle</w:t>
+        <w:t>Use Case 2: Return Vehicle</w:t>
       </w:r>
     </w:p>
     <w:p>
@@ -4504,43 +4384,7 @@
         <w:rPr>
           <w:lang w:val="en-US"/>
         </w:rPr>
-        <w:t xml:space="preserve"> A rider </w:t>
-      </w:r>
-      <w:r>
-        <w:rPr>
-          <w:lang w:val="en-US"/>
-        </w:rPr>
-        <w:t xml:space="preserve">returns </w:t>
-      </w:r>
-      <w:r>
-        <w:rPr>
-          <w:lang w:val="en-US"/>
-        </w:rPr>
-        <w:t xml:space="preserve">a </w:t>
-      </w:r>
-      <w:r>
-        <w:rPr>
-          <w:lang w:val="en-US"/>
-        </w:rPr>
-        <w:t xml:space="preserve">rented </w:t>
-      </w:r>
-      <w:r>
-        <w:rPr>
-          <w:lang w:val="en-US"/>
-        </w:rPr>
-        <w:t xml:space="preserve">vehicle </w:t>
-      </w:r>
-      <w:r>
-        <w:rPr>
-          <w:lang w:val="en-US"/>
-        </w:rPr>
-        <w:t>to end a trip.</w:t>
-      </w:r>
-      <w:r>
-        <w:rPr>
-          <w:lang w:val="en-US"/>
-        </w:rPr>
-        <w:t xml:space="preserve"> </w:t>
+        <w:t xml:space="preserve"> A rider returns a rented vehicle to end a trip. </w:t>
       </w:r>
     </w:p>
     <w:p>
@@ -4563,13 +4407,7 @@
         <w:rPr>
           <w:lang w:val="en-US"/>
         </w:rPr>
-        <w:t xml:space="preserve"> </w:t>
-      </w:r>
-      <w:r>
-        <w:rPr>
-          <w:lang w:val="en-US"/>
-        </w:rPr>
-        <w:t>The vehicle is on an active trip.</w:t>
+        <w:t xml:space="preserve"> The vehicle is on an active trip.</w:t>
       </w:r>
     </w:p>
     <w:p>
@@ -4884,25 +4722,7 @@
         <w:rPr>
           <w:lang w:val="en-US"/>
         </w:rPr>
-        <w:t xml:space="preserve">Use Case </w:t>
-      </w:r>
-      <w:r>
-        <w:rPr>
-          <w:lang w:val="en-US"/>
-        </w:rPr>
-        <w:t>3</w:t>
-      </w:r>
-      <w:r>
-        <w:rPr>
-          <w:lang w:val="en-US"/>
-        </w:rPr>
-        <w:t xml:space="preserve">: </w:t>
-      </w:r>
-      <w:r>
-        <w:rPr>
-          <w:lang w:val="en-US"/>
-        </w:rPr>
-        <w:t>Report Vehicle Problem</w:t>
+        <w:t>Use Case 3: Report Vehicle Problem</w:t>
       </w:r>
     </w:p>
     <w:p>
@@ -4983,13 +4803,7 @@
         <w:rPr>
           <w:lang w:val="en-US"/>
         </w:rPr>
-        <w:t xml:space="preserve"> The vehicle </w:t>
-      </w:r>
-      <w:r>
-        <w:rPr>
-          <w:lang w:val="en-US"/>
-        </w:rPr>
-        <w:t>can be identified.</w:t>
+        <w:t xml:space="preserve"> The vehicle can be identified.</w:t>
       </w:r>
     </w:p>
     <w:p>
@@ -5232,6 +5046,73 @@
       </w:pPr>
       <w:r>
         <w:rPr>
+          <w:noProof/>
+        </w:rPr>
+        <w:drawing>
+          <wp:anchor distT="0" distB="0" distL="114300" distR="114300" simplePos="0" relativeHeight="251660288" behindDoc="0" locked="0" layoutInCell="1" allowOverlap="1" wp14:anchorId="0A07051E" wp14:editId="211080B9">
+            <wp:simplePos x="0" y="0"/>
+            <wp:positionH relativeFrom="column">
+              <wp:posOffset>-2056674</wp:posOffset>
+            </wp:positionH>
+            <wp:positionV relativeFrom="paragraph">
+              <wp:posOffset>2093595</wp:posOffset>
+            </wp:positionV>
+            <wp:extent cx="8155832" cy="4012565"/>
+            <wp:effectExtent l="0" t="5080" r="0" b="0"/>
+            <wp:wrapNone/>
+            <wp:docPr id="1038833675" name="Picture 3"/>
+            <wp:cNvGraphicFramePr>
+              <a:graphicFrameLocks xmlns:a="http://schemas.openxmlformats.org/drawingml/2006/main" noChangeAspect="1"/>
+            </wp:cNvGraphicFramePr>
+            <a:graphic xmlns:a="http://schemas.openxmlformats.org/drawingml/2006/main">
+              <a:graphicData uri="http://schemas.openxmlformats.org/drawingml/2006/picture">
+                <pic:pic xmlns:pic="http://schemas.openxmlformats.org/drawingml/2006/picture">
+                  <pic:nvPicPr>
+                    <pic:cNvPr id="0" name="Picture 3"/>
+                    <pic:cNvPicPr>
+                      <a:picLocks noChangeAspect="1" noChangeArrowheads="1"/>
+                    </pic:cNvPicPr>
+                  </pic:nvPicPr>
+                  <pic:blipFill>
+                    <a:blip r:embed="rId7" cstate="print">
+                      <a:extLst>
+                        <a:ext uri="{28A0092B-C50C-407E-A947-70E740481C1C}">
+                          <a14:useLocalDpi xmlns:a14="http://schemas.microsoft.com/office/drawing/2010/main" val="0"/>
+                        </a:ext>
+                      </a:extLst>
+                    </a:blip>
+                    <a:srcRect/>
+                    <a:stretch>
+                      <a:fillRect/>
+                    </a:stretch>
+                  </pic:blipFill>
+                  <pic:spPr bwMode="auto">
+                    <a:xfrm rot="5400000">
+                      <a:off x="0" y="0"/>
+                      <a:ext cx="8155832" cy="4012565"/>
+                    </a:xfrm>
+                    <a:prstGeom prst="rect">
+                      <a:avLst/>
+                    </a:prstGeom>
+                    <a:noFill/>
+                    <a:ln>
+                      <a:noFill/>
+                    </a:ln>
+                  </pic:spPr>
+                </pic:pic>
+              </a:graphicData>
+            </a:graphic>
+            <wp14:sizeRelH relativeFrom="margin">
+              <wp14:pctWidth>0</wp14:pctWidth>
+            </wp14:sizeRelH>
+            <wp14:sizeRelV relativeFrom="margin">
+              <wp14:pctHeight>0</wp14:pctHeight>
+            </wp14:sizeRelV>
+          </wp:anchor>
+        </w:drawing>
+      </w:r>
+      <w:r>
+        <w:rPr>
           <w:lang w:val="en-US"/>
         </w:rPr>
         <w:br w:type="page"/>
@@ -5288,15 +5169,13 @@
           <w:lang w:val="en-US"/>
         </w:rPr>
       </w:pPr>
-      <w:proofErr w:type="spellStart"/>
       <w:r>
         <w:rPr>
           <w:rFonts w:ascii="Courier New" w:hAnsi="Courier New" w:cs="Courier New"/>
           <w:lang w:val="en-US"/>
         </w:rPr>
-        <w:t>PricingPolicy</w:t>
-      </w:r>
-      <w:proofErr w:type="spellEnd"/>
+        <w:t>PricingService</w:t>
+      </w:r>
     </w:p>
     <w:p>
       <w:pPr>
@@ -5311,15 +5190,13 @@
           <w:lang w:val="en-US"/>
         </w:rPr>
       </w:pPr>
-      <w:proofErr w:type="spellStart"/>
       <w:r>
         <w:rPr>
           <w:rFonts w:ascii="Courier New" w:hAnsi="Courier New" w:cs="Courier New"/>
           <w:lang w:val="en-US"/>
         </w:rPr>
-        <w:t>CasualPricingPolicy</w:t>
-      </w:r>
-      <w:proofErr w:type="spellEnd"/>
+        <w:t>PricingPolicy</w:t>
+      </w:r>
     </w:p>
     <w:p>
       <w:pPr>
@@ -5334,15 +5211,13 @@
           <w:lang w:val="en-US"/>
         </w:rPr>
       </w:pPr>
-      <w:proofErr w:type="spellStart"/>
       <w:r>
         <w:rPr>
           <w:rFonts w:ascii="Courier New" w:hAnsi="Courier New" w:cs="Courier New"/>
           <w:lang w:val="en-US"/>
         </w:rPr>
-        <w:t>MemberPricingPolicy</w:t>
-      </w:r>
-      <w:proofErr w:type="spellEnd"/>
+        <w:t>CasualPricingPolicy</w:t>
+      </w:r>
     </w:p>
     <w:p>
       <w:pPr>
@@ -5357,15 +5232,13 @@
           <w:lang w:val="en-US"/>
         </w:rPr>
       </w:pPr>
-      <w:proofErr w:type="spellStart"/>
       <w:r>
         <w:rPr>
           <w:rFonts w:ascii="Courier New" w:hAnsi="Courier New" w:cs="Courier New"/>
           <w:lang w:val="en-US"/>
         </w:rPr>
-        <w:t>StudentPricingPolicy</w:t>
-      </w:r>
-      <w:proofErr w:type="spellEnd"/>
+        <w:t>MemberPricingPolicy</w:t>
+      </w:r>
     </w:p>
     <w:p>
       <w:pPr>
@@ -5380,37 +5253,125 @@
           <w:lang w:val="en-US"/>
         </w:rPr>
       </w:pPr>
-      <w:proofErr w:type="spellStart"/>
-      <w:proofErr w:type="gramStart"/>
       <w:r>
         <w:rPr>
           <w:rFonts w:ascii="Courier New" w:hAnsi="Courier New" w:cs="Courier New"/>
           <w:lang w:val="en-US"/>
         </w:rPr>
-        <w:t>PricingService</w:t>
-      </w:r>
-      <w:proofErr w:type="spellEnd"/>
-      <w:proofErr w:type="gramEnd"/>
-    </w:p>
-    <w:p>
-      <w:pPr>
-        <w:spacing w:after="0" w:line="240" w:lineRule="auto"/>
-        <w:rPr>
-          <w:lang w:val="en-US"/>
-        </w:rPr>
-      </w:pPr>
-    </w:p>
-    <w:p>
-      <w:pPr>
-        <w:spacing w:after="0" w:line="240" w:lineRule="auto"/>
-        <w:rPr>
-          <w:lang w:val="en-US"/>
-        </w:rPr>
-      </w:pPr>
-      <w:r>
-        <w:rPr>
-          <w:lang w:val="en-US"/>
-        </w:rPr>
+        <w:t>StudentPricingPolicy</w:t>
+      </w:r>
+    </w:p>
+    <w:p>
+      <w:pPr>
+        <w:spacing w:after="0" w:line="240" w:lineRule="auto"/>
+        <w:rPr>
+          <w:lang w:val="en-US"/>
+        </w:rPr>
+      </w:pPr>
+    </w:p>
+    <w:p>
+      <w:pPr>
+        <w:spacing w:after="0" w:line="240" w:lineRule="auto"/>
+        <w:rPr>
+          <w:lang w:val="en-US"/>
+        </w:rPr>
+      </w:pPr>
+      <w:r>
+        <w:rPr>
+          <w:lang w:val="en-US"/>
+        </w:rPr>
+        <w:t>Here is the UML diagram for the Strategy pattern:</w:t>
+      </w:r>
+    </w:p>
+    <w:p>
+      <w:pPr>
+        <w:spacing w:after="0" w:line="240" w:lineRule="auto"/>
+        <w:rPr>
+          <w:lang w:val="en-US"/>
+        </w:rPr>
+      </w:pPr>
+      <w:r>
+        <w:rPr>
+          <w:noProof/>
+        </w:rPr>
+        <w:drawing>
+          <wp:inline distT="0" distB="0" distL="0" distR="0" wp14:anchorId="063FBF96" wp14:editId="272066B2">
+            <wp:extent cx="5725795" cy="5111115"/>
+            <wp:effectExtent l="0" t="0" r="8255" b="0"/>
+            <wp:docPr id="1348301506" name="Picture 9"/>
+            <wp:cNvGraphicFramePr>
+              <a:graphicFrameLocks xmlns:a="http://schemas.openxmlformats.org/drawingml/2006/main" noChangeAspect="1"/>
+            </wp:cNvGraphicFramePr>
+            <a:graphic xmlns:a="http://schemas.openxmlformats.org/drawingml/2006/main">
+              <a:graphicData uri="http://schemas.openxmlformats.org/drawingml/2006/picture">
+                <pic:pic xmlns:pic="http://schemas.openxmlformats.org/drawingml/2006/picture">
+                  <pic:nvPicPr>
+                    <pic:cNvPr id="0" name="Picture 5"/>
+                    <pic:cNvPicPr>
+                      <a:picLocks noChangeAspect="1" noChangeArrowheads="1"/>
+                    </pic:cNvPicPr>
+                  </pic:nvPicPr>
+                  <pic:blipFill>
+                    <a:blip r:embed="rId8" cstate="print">
+                      <a:extLst>
+                        <a:ext uri="{28A0092B-C50C-407E-A947-70E740481C1C}">
+                          <a14:useLocalDpi xmlns:a14="http://schemas.microsoft.com/office/drawing/2010/main" val="0"/>
+                        </a:ext>
+                      </a:extLst>
+                    </a:blip>
+                    <a:srcRect/>
+                    <a:stretch>
+                      <a:fillRect/>
+                    </a:stretch>
+                  </pic:blipFill>
+                  <pic:spPr bwMode="auto">
+                    <a:xfrm>
+                      <a:off x="0" y="0"/>
+                      <a:ext cx="5725795" cy="5111115"/>
+                    </a:xfrm>
+                    <a:prstGeom prst="rect">
+                      <a:avLst/>
+                    </a:prstGeom>
+                    <a:noFill/>
+                    <a:ln>
+                      <a:noFill/>
+                    </a:ln>
+                  </pic:spPr>
+                </pic:pic>
+              </a:graphicData>
+            </a:graphic>
+          </wp:inline>
+        </w:drawing>
+      </w:r>
+    </w:p>
+    <w:p>
+      <w:pPr>
+        <w:spacing w:after="0" w:line="240" w:lineRule="auto"/>
+        <w:rPr>
+          <w:lang w:val="en-US"/>
+        </w:rPr>
+      </w:pPr>
+    </w:p>
+    <w:p>
+      <w:pPr>
+        <w:spacing w:after="0" w:line="240" w:lineRule="auto"/>
+        <w:rPr>
+          <w:lang w:val="en-US"/>
+        </w:rPr>
+      </w:pPr>
+    </w:p>
+    <w:p>
+      <w:pPr>
+        <w:spacing w:after="0" w:line="240" w:lineRule="auto"/>
+        <w:rPr>
+          <w:lang w:val="en-US"/>
+        </w:rPr>
+      </w:pPr>
+      <w:r>
+        <w:rPr>
+          <w:lang w:val="en-US"/>
+        </w:rPr>
+        <w:lastRenderedPageBreak/>
         <w:t xml:space="preserve">When a vehicle is reported as broken, it is important to notify all affected participants, in this case, that is the maintenance teams and operators. </w:t>
       </w:r>
       <w:r>
@@ -5429,17 +5390,17 @@
         </w:numPr>
         <w:spacing w:after="0" w:line="240" w:lineRule="auto"/>
         <w:rPr>
-          <w:lang w:val="en-US"/>
-        </w:rPr>
-      </w:pPr>
-      <w:proofErr w:type="spellStart"/>
-      <w:r>
-        <w:rPr>
+          <w:rFonts w:ascii="Courier New" w:hAnsi="Courier New" w:cs="Courier New"/>
+          <w:lang w:val="en-US"/>
+        </w:rPr>
+      </w:pPr>
+      <w:r>
+        <w:rPr>
+          <w:rFonts w:ascii="Courier New" w:hAnsi="Courier New" w:cs="Courier New"/>
           <w:lang w:val="en-US"/>
         </w:rPr>
         <w:t>FaultService</w:t>
       </w:r>
-      <w:proofErr w:type="spellEnd"/>
     </w:p>
     <w:p>
       <w:pPr>
@@ -5450,17 +5411,17 @@
         </w:numPr>
         <w:spacing w:after="0" w:line="240" w:lineRule="auto"/>
         <w:rPr>
-          <w:lang w:val="en-US"/>
-        </w:rPr>
-      </w:pPr>
-      <w:proofErr w:type="spellStart"/>
-      <w:r>
-        <w:rPr>
+          <w:rFonts w:ascii="Courier New" w:hAnsi="Courier New" w:cs="Courier New"/>
+          <w:lang w:val="en-US"/>
+        </w:rPr>
+      </w:pPr>
+      <w:r>
+        <w:rPr>
+          <w:rFonts w:ascii="Courier New" w:hAnsi="Courier New" w:cs="Courier New"/>
           <w:lang w:val="en-US"/>
         </w:rPr>
         <w:t>FaultObserver</w:t>
       </w:r>
-      <w:proofErr w:type="spellEnd"/>
     </w:p>
     <w:p>
       <w:pPr>
@@ -5471,17 +5432,17 @@
         </w:numPr>
         <w:spacing w:after="0" w:line="240" w:lineRule="auto"/>
         <w:rPr>
-          <w:lang w:val="en-US"/>
-        </w:rPr>
-      </w:pPr>
-      <w:proofErr w:type="spellStart"/>
-      <w:r>
-        <w:rPr>
+          <w:rFonts w:ascii="Courier New" w:hAnsi="Courier New" w:cs="Courier New"/>
+          <w:lang w:val="en-US"/>
+        </w:rPr>
+      </w:pPr>
+      <w:r>
+        <w:rPr>
+          <w:rFonts w:ascii="Courier New" w:hAnsi="Courier New" w:cs="Courier New"/>
           <w:lang w:val="en-US"/>
         </w:rPr>
         <w:t>MaintenanceNotifier</w:t>
       </w:r>
-      <w:proofErr w:type="spellEnd"/>
     </w:p>
     <w:p>
       <w:pPr>
@@ -5492,37 +5453,166 @@
         </w:numPr>
         <w:spacing w:after="0" w:line="240" w:lineRule="auto"/>
         <w:rPr>
-          <w:lang w:val="en-US"/>
-        </w:rPr>
-      </w:pPr>
-      <w:proofErr w:type="spellStart"/>
-      <w:r>
-        <w:rPr>
+          <w:rFonts w:ascii="Courier New" w:hAnsi="Courier New" w:cs="Courier New"/>
+          <w:lang w:val="en-US"/>
+        </w:rPr>
+      </w:pPr>
+      <w:r>
+        <w:rPr>
+          <w:rFonts w:ascii="Courier New" w:hAnsi="Courier New" w:cs="Courier New"/>
           <w:lang w:val="en-US"/>
         </w:rPr>
         <w:t>OperatorDashboard</w:t>
       </w:r>
-      <w:proofErr w:type="spellEnd"/>
-    </w:p>
-    <w:p>
-      <w:pPr>
-        <w:spacing w:after="0" w:line="240" w:lineRule="auto"/>
-        <w:rPr>
-          <w:lang w:val="en-US"/>
-        </w:rPr>
-      </w:pPr>
-    </w:p>
-    <w:p>
-      <w:pPr>
-        <w:spacing w:after="0" w:line="240" w:lineRule="auto"/>
-        <w:rPr>
-          <w:lang w:val="en-US"/>
-        </w:rPr>
-      </w:pPr>
-      <w:r>
-        <w:rPr>
-          <w:lang w:val="en-US"/>
-        </w:rPr>
+    </w:p>
+    <w:p>
+      <w:pPr>
+        <w:pStyle w:val="ListParagraph"/>
+        <w:numPr>
+          <w:ilvl w:val="0"/>
+          <w:numId w:val="6"/>
+        </w:numPr>
+        <w:spacing w:after="0" w:line="240" w:lineRule="auto"/>
+        <w:rPr>
+          <w:rFonts w:ascii="Courier New" w:hAnsi="Courier New" w:cs="Courier New"/>
+          <w:lang w:val="en-US"/>
+        </w:rPr>
+      </w:pPr>
+      <w:r>
+        <w:rPr>
+          <w:rFonts w:ascii="Courier New" w:hAnsi="Courier New" w:cs="Courier New"/>
+          <w:lang w:val="en-US"/>
+        </w:rPr>
+        <w:t>FaultReport</w:t>
+      </w:r>
+    </w:p>
+    <w:p>
+      <w:pPr>
+        <w:spacing w:after="0" w:line="240" w:lineRule="auto"/>
+        <w:rPr>
+          <w:lang w:val="en-US"/>
+        </w:rPr>
+      </w:pPr>
+    </w:p>
+    <w:p>
+      <w:pPr>
+        <w:spacing w:after="0" w:line="240" w:lineRule="auto"/>
+        <w:rPr>
+          <w:lang w:val="en-US"/>
+        </w:rPr>
+      </w:pPr>
+      <w:r>
+        <w:rPr>
+          <w:lang w:val="en-US"/>
+        </w:rPr>
+        <w:t>Here is the UML diagram for the Observer pattern:</w:t>
+      </w:r>
+    </w:p>
+    <w:p>
+      <w:pPr>
+        <w:spacing w:after="0" w:line="240" w:lineRule="auto"/>
+        <w:rPr>
+          <w:lang w:val="en-US"/>
+        </w:rPr>
+      </w:pPr>
+      <w:r>
+        <w:rPr>
+          <w:noProof/>
+        </w:rPr>
+        <w:drawing>
+          <wp:inline distT="0" distB="0" distL="0" distR="0" wp14:anchorId="1003F90F" wp14:editId="7264FBE5">
+            <wp:extent cx="5943600" cy="5262245"/>
+            <wp:effectExtent l="0" t="0" r="0" b="0"/>
+            <wp:docPr id="1448435078" name="Picture 10"/>
+            <wp:cNvGraphicFramePr>
+              <a:graphicFrameLocks xmlns:a="http://schemas.openxmlformats.org/drawingml/2006/main" noChangeAspect="1"/>
+            </wp:cNvGraphicFramePr>
+            <a:graphic xmlns:a="http://schemas.openxmlformats.org/drawingml/2006/main">
+              <a:graphicData uri="http://schemas.openxmlformats.org/drawingml/2006/picture">
+                <pic:pic xmlns:pic="http://schemas.openxmlformats.org/drawingml/2006/picture">
+                  <pic:nvPicPr>
+                    <pic:cNvPr id="0" name="Picture 7"/>
+                    <pic:cNvPicPr>
+                      <a:picLocks noChangeAspect="1" noChangeArrowheads="1"/>
+                    </pic:cNvPicPr>
+                  </pic:nvPicPr>
+                  <pic:blipFill>
+                    <a:blip r:embed="rId9" cstate="print">
+                      <a:extLst>
+                        <a:ext uri="{28A0092B-C50C-407E-A947-70E740481C1C}">
+                          <a14:useLocalDpi xmlns:a14="http://schemas.microsoft.com/office/drawing/2010/main" val="0"/>
+                        </a:ext>
+                      </a:extLst>
+                    </a:blip>
+                    <a:srcRect/>
+                    <a:stretch>
+                      <a:fillRect/>
+                    </a:stretch>
+                  </pic:blipFill>
+                  <pic:spPr bwMode="auto">
+                    <a:xfrm>
+                      <a:off x="0" y="0"/>
+                      <a:ext cx="5943600" cy="5262245"/>
+                    </a:xfrm>
+                    <a:prstGeom prst="rect">
+                      <a:avLst/>
+                    </a:prstGeom>
+                    <a:noFill/>
+                    <a:ln>
+                      <a:noFill/>
+                    </a:ln>
+                  </pic:spPr>
+                </pic:pic>
+              </a:graphicData>
+            </a:graphic>
+          </wp:inline>
+        </w:drawing>
+      </w:r>
+    </w:p>
+    <w:p>
+      <w:pPr>
+        <w:spacing w:after="0" w:line="240" w:lineRule="auto"/>
+        <w:rPr>
+          <w:lang w:val="en-US"/>
+        </w:rPr>
+      </w:pPr>
+    </w:p>
+    <w:p>
+      <w:pPr>
+        <w:spacing w:after="0" w:line="240" w:lineRule="auto"/>
+        <w:rPr>
+          <w:lang w:val="en-US"/>
+        </w:rPr>
+      </w:pPr>
+    </w:p>
+    <w:p>
+      <w:pPr>
+        <w:spacing w:after="0" w:line="240" w:lineRule="auto"/>
+        <w:rPr>
+          <w:lang w:val="en-US"/>
+        </w:rPr>
+      </w:pPr>
+    </w:p>
+    <w:p>
+      <w:pPr>
+        <w:spacing w:after="0" w:line="240" w:lineRule="auto"/>
+        <w:rPr>
+          <w:lang w:val="en-US"/>
+        </w:rPr>
+      </w:pPr>
+    </w:p>
+    <w:p>
+      <w:pPr>
+        <w:spacing w:after="0" w:line="240" w:lineRule="auto"/>
+        <w:rPr>
+          <w:lang w:val="en-US"/>
+        </w:rPr>
+      </w:pPr>
+      <w:r>
+        <w:rPr>
+          <w:lang w:val="en-US"/>
+        </w:rPr>
+        <w:lastRenderedPageBreak/>
         <w:t>Here is how we implemented each letter of the SOLID principles:</w:t>
       </w:r>
     </w:p>
@@ -5629,16 +5719,8 @@
               <w:rPr>
                 <w:lang w:val="en-US"/>
               </w:rPr>
-              <w:t xml:space="preserve">New pricing policies and fault observers can be added without modifying the services that </w:t>
-            </w:r>
-            <w:proofErr w:type="gramStart"/>
-            <w:r>
-              <w:rPr>
-                <w:lang w:val="en-US"/>
-              </w:rPr>
-              <w:t>use them</w:t>
-            </w:r>
-            <w:proofErr w:type="gramEnd"/>
+              <w:t>New pricing policies and fault observers can be added without modifying the services that use them</w:t>
+            </w:r>
             <w:r>
               <w:rPr>
                 <w:lang w:val="en-US"/>
@@ -5798,7 +5880,6 @@
               </w:rPr>
               <w:t xml:space="preserve">; </w:t>
             </w:r>
-            <w:proofErr w:type="spellStart"/>
             <w:r>
               <w:rPr>
                 <w:rFonts w:ascii="Courier New" w:hAnsi="Courier New" w:cs="Courier New"/>
@@ -5806,14 +5887,12 @@
               </w:rPr>
               <w:t>TripService</w:t>
             </w:r>
-            <w:proofErr w:type="spellEnd"/>
             <w:r>
               <w:rPr>
                 <w:lang w:val="en-US"/>
               </w:rPr>
               <w:t xml:space="preserve"> depends on </w:t>
             </w:r>
-            <w:proofErr w:type="spellStart"/>
             <w:r>
               <w:rPr>
                 <w:rFonts w:ascii="Courier New" w:hAnsi="Courier New" w:cs="Courier New"/>
@@ -5821,7 +5900,6 @@
               </w:rPr>
               <w:t>DockingGateway</w:t>
             </w:r>
-            <w:proofErr w:type="spellEnd"/>
             <w:r>
               <w:rPr>
                 <w:lang w:val="en-US"/>
@@ -5845,6 +5923,282 @@
           <w:lang w:val="en-US"/>
         </w:rPr>
       </w:pPr>
+    </w:p>
+    <w:p>
+      <w:pPr>
+        <w:rPr>
+          <w:lang w:val="en-US"/>
+        </w:rPr>
+      </w:pPr>
+      <w:r>
+        <w:rPr>
+          <w:lang w:val="en-US"/>
+        </w:rPr>
+        <w:br w:type="page"/>
+      </w:r>
+    </w:p>
+    <w:p>
+      <w:pPr>
+        <w:pStyle w:val="Heading1"/>
+        <w:spacing w:before="0" w:after="0" w:line="240" w:lineRule="auto"/>
+        <w:contextualSpacing/>
+        <w:rPr>
+          <w:lang w:val="en-US"/>
+        </w:rPr>
+      </w:pPr>
+      <w:r>
+        <w:rPr>
+          <w:lang w:val="en-US"/>
+        </w:rPr>
+        <w:lastRenderedPageBreak/>
+        <w:t>Appendix A: Additional UML Diagrams</w:t>
+      </w:r>
+      <w:r>
+        <w:rPr>
+          <w:noProof/>
+          <w:lang w:val="en-US"/>
+        </w:rPr>
+        <w:drawing>
+          <wp:inline distT="0" distB="0" distL="0" distR="0" wp14:anchorId="7EED1CDD" wp14:editId="549850EA">
+            <wp:extent cx="5943600" cy="4017645"/>
+            <wp:effectExtent l="0" t="0" r="0" b="1905"/>
+            <wp:docPr id="358718536" name="Picture 4"/>
+            <wp:cNvGraphicFramePr>
+              <a:graphicFrameLocks xmlns:a="http://schemas.openxmlformats.org/drawingml/2006/main" noChangeAspect="1"/>
+            </wp:cNvGraphicFramePr>
+            <a:graphic xmlns:a="http://schemas.openxmlformats.org/drawingml/2006/main">
+              <a:graphicData uri="http://schemas.openxmlformats.org/drawingml/2006/picture">
+                <pic:pic xmlns:pic="http://schemas.openxmlformats.org/drawingml/2006/picture">
+                  <pic:nvPicPr>
+                    <pic:cNvPr id="358718536" name="Picture 358718536"/>
+                    <pic:cNvPicPr/>
+                  </pic:nvPicPr>
+                  <pic:blipFill>
+                    <a:blip r:embed="rId10" cstate="print">
+                      <a:extLst>
+                        <a:ext uri="{28A0092B-C50C-407E-A947-70E740481C1C}">
+                          <a14:useLocalDpi xmlns:a14="http://schemas.microsoft.com/office/drawing/2010/main" val="0"/>
+                        </a:ext>
+                      </a:extLst>
+                    </a:blip>
+                    <a:stretch>
+                      <a:fillRect/>
+                    </a:stretch>
+                  </pic:blipFill>
+                  <pic:spPr>
+                    <a:xfrm>
+                      <a:off x="0" y="0"/>
+                      <a:ext cx="5943600" cy="4017645"/>
+                    </a:xfrm>
+                    <a:prstGeom prst="rect">
+                      <a:avLst/>
+                    </a:prstGeom>
+                  </pic:spPr>
+                </pic:pic>
+              </a:graphicData>
+            </a:graphic>
+          </wp:inline>
+        </w:drawing>
+      </w:r>
+    </w:p>
+    <w:p>
+      <w:pPr>
+        <w:rPr>
+          <w:lang w:val="en-US"/>
+        </w:rPr>
+      </w:pPr>
+      <w:r>
+        <w:rPr>
+          <w:noProof/>
+          <w:lang w:val="en-US"/>
+        </w:rPr>
+        <w:lastRenderedPageBreak/>
+        <w:drawing>
+          <wp:inline distT="0" distB="0" distL="0" distR="0" wp14:anchorId="6F026CD7" wp14:editId="2E1E1F02">
+            <wp:extent cx="5943600" cy="6386195"/>
+            <wp:effectExtent l="0" t="0" r="0" b="0"/>
+            <wp:docPr id="843462845" name="Picture 5"/>
+            <wp:cNvGraphicFramePr>
+              <a:graphicFrameLocks xmlns:a="http://schemas.openxmlformats.org/drawingml/2006/main" noChangeAspect="1"/>
+            </wp:cNvGraphicFramePr>
+            <a:graphic xmlns:a="http://schemas.openxmlformats.org/drawingml/2006/main">
+              <a:graphicData uri="http://schemas.openxmlformats.org/drawingml/2006/picture">
+                <pic:pic xmlns:pic="http://schemas.openxmlformats.org/drawingml/2006/picture">
+                  <pic:nvPicPr>
+                    <pic:cNvPr id="843462845" name="Picture 843462845"/>
+                    <pic:cNvPicPr/>
+                  </pic:nvPicPr>
+                  <pic:blipFill>
+                    <a:blip r:embed="rId11" cstate="print">
+                      <a:extLst>
+                        <a:ext uri="{28A0092B-C50C-407E-A947-70E740481C1C}">
+                          <a14:useLocalDpi xmlns:a14="http://schemas.microsoft.com/office/drawing/2010/main" val="0"/>
+                        </a:ext>
+                      </a:extLst>
+                    </a:blip>
+                    <a:stretch>
+                      <a:fillRect/>
+                    </a:stretch>
+                  </pic:blipFill>
+                  <pic:spPr>
+                    <a:xfrm>
+                      <a:off x="0" y="0"/>
+                      <a:ext cx="5943600" cy="6386195"/>
+                    </a:xfrm>
+                    <a:prstGeom prst="rect">
+                      <a:avLst/>
+                    </a:prstGeom>
+                  </pic:spPr>
+                </pic:pic>
+              </a:graphicData>
+            </a:graphic>
+          </wp:inline>
+        </w:drawing>
+      </w:r>
+      <w:r>
+        <w:rPr>
+          <w:noProof/>
+          <w:lang w:val="en-US"/>
+        </w:rPr>
+        <w:lastRenderedPageBreak/>
+        <w:drawing>
+          <wp:inline distT="0" distB="0" distL="0" distR="0" wp14:anchorId="6758D84A" wp14:editId="2BFD43C8">
+            <wp:extent cx="5943600" cy="6193155"/>
+            <wp:effectExtent l="0" t="0" r="0" b="0"/>
+            <wp:docPr id="326839063" name="Picture 6"/>
+            <wp:cNvGraphicFramePr>
+              <a:graphicFrameLocks xmlns:a="http://schemas.openxmlformats.org/drawingml/2006/main" noChangeAspect="1"/>
+            </wp:cNvGraphicFramePr>
+            <a:graphic xmlns:a="http://schemas.openxmlformats.org/drawingml/2006/main">
+              <a:graphicData uri="http://schemas.openxmlformats.org/drawingml/2006/picture">
+                <pic:pic xmlns:pic="http://schemas.openxmlformats.org/drawingml/2006/picture">
+                  <pic:nvPicPr>
+                    <pic:cNvPr id="326839063" name="Picture 326839063"/>
+                    <pic:cNvPicPr/>
+                  </pic:nvPicPr>
+                  <pic:blipFill>
+                    <a:blip r:embed="rId12" cstate="print">
+                      <a:extLst>
+                        <a:ext uri="{28A0092B-C50C-407E-A947-70E740481C1C}">
+                          <a14:useLocalDpi xmlns:a14="http://schemas.microsoft.com/office/drawing/2010/main" val="0"/>
+                        </a:ext>
+                      </a:extLst>
+                    </a:blip>
+                    <a:stretch>
+                      <a:fillRect/>
+                    </a:stretch>
+                  </pic:blipFill>
+                  <pic:spPr>
+                    <a:xfrm>
+                      <a:off x="0" y="0"/>
+                      <a:ext cx="5943600" cy="6193155"/>
+                    </a:xfrm>
+                    <a:prstGeom prst="rect">
+                      <a:avLst/>
+                    </a:prstGeom>
+                  </pic:spPr>
+                </pic:pic>
+              </a:graphicData>
+            </a:graphic>
+          </wp:inline>
+        </w:drawing>
+      </w:r>
+      <w:r>
+        <w:rPr>
+          <w:noProof/>
+          <w:lang w:val="en-US"/>
+        </w:rPr>
+        <w:lastRenderedPageBreak/>
+        <w:drawing>
+          <wp:inline distT="0" distB="0" distL="0" distR="0" wp14:anchorId="5070460E" wp14:editId="78F361D6">
+            <wp:extent cx="8270527" cy="4445408"/>
+            <wp:effectExtent l="7620" t="0" r="5080" b="5080"/>
+            <wp:docPr id="1166493649" name="Picture 7"/>
+            <wp:cNvGraphicFramePr>
+              <a:graphicFrameLocks xmlns:a="http://schemas.openxmlformats.org/drawingml/2006/main" noChangeAspect="1"/>
+            </wp:cNvGraphicFramePr>
+            <a:graphic xmlns:a="http://schemas.openxmlformats.org/drawingml/2006/main">
+              <a:graphicData uri="http://schemas.openxmlformats.org/drawingml/2006/picture">
+                <pic:pic xmlns:pic="http://schemas.openxmlformats.org/drawingml/2006/picture">
+                  <pic:nvPicPr>
+                    <pic:cNvPr id="1166493649" name="Picture 1166493649"/>
+                    <pic:cNvPicPr/>
+                  </pic:nvPicPr>
+                  <pic:blipFill>
+                    <a:blip r:embed="rId13" cstate="print">
+                      <a:extLst>
+                        <a:ext uri="{28A0092B-C50C-407E-A947-70E740481C1C}">
+                          <a14:useLocalDpi xmlns:a14="http://schemas.microsoft.com/office/drawing/2010/main" val="0"/>
+                        </a:ext>
+                      </a:extLst>
+                    </a:blip>
+                    <a:stretch>
+                      <a:fillRect/>
+                    </a:stretch>
+                  </pic:blipFill>
+                  <pic:spPr>
+                    <a:xfrm rot="5400000">
+                      <a:off x="0" y="0"/>
+                      <a:ext cx="8283259" cy="4452252"/>
+                    </a:xfrm>
+                    <a:prstGeom prst="rect">
+                      <a:avLst/>
+                    </a:prstGeom>
+                  </pic:spPr>
+                </pic:pic>
+              </a:graphicData>
+            </a:graphic>
+          </wp:inline>
+        </w:drawing>
+      </w:r>
+      <w:r>
+        <w:rPr>
+          <w:noProof/>
+          <w:lang w:val="en-US"/>
+        </w:rPr>
+        <w:lastRenderedPageBreak/>
+        <w:drawing>
+          <wp:inline distT="0" distB="0" distL="0" distR="0" wp14:anchorId="3DBD3183" wp14:editId="6A7A82A8">
+            <wp:extent cx="3947795" cy="8229600"/>
+            <wp:effectExtent l="0" t="0" r="0" b="0"/>
+            <wp:docPr id="1069333181" name="Picture 8"/>
+            <wp:cNvGraphicFramePr>
+              <a:graphicFrameLocks xmlns:a="http://schemas.openxmlformats.org/drawingml/2006/main" noChangeAspect="1"/>
+            </wp:cNvGraphicFramePr>
+            <a:graphic xmlns:a="http://schemas.openxmlformats.org/drawingml/2006/main">
+              <a:graphicData uri="http://schemas.openxmlformats.org/drawingml/2006/picture">
+                <pic:pic xmlns:pic="http://schemas.openxmlformats.org/drawingml/2006/picture">
+                  <pic:nvPicPr>
+                    <pic:cNvPr id="1069333181" name="Picture 1069333181"/>
+                    <pic:cNvPicPr/>
+                  </pic:nvPicPr>
+                  <pic:blipFill>
+                    <a:blip r:embed="rId14" cstate="print">
+                      <a:extLst>
+                        <a:ext uri="{28A0092B-C50C-407E-A947-70E740481C1C}">
+                          <a14:useLocalDpi xmlns:a14="http://schemas.microsoft.com/office/drawing/2010/main" val="0"/>
+                        </a:ext>
+                      </a:extLst>
+                    </a:blip>
+                    <a:stretch>
+                      <a:fillRect/>
+                    </a:stretch>
+                  </pic:blipFill>
+                  <pic:spPr>
+                    <a:xfrm>
+                      <a:off x="0" y="0"/>
+                      <a:ext cx="3947795" cy="8229600"/>
+                    </a:xfrm>
+                    <a:prstGeom prst="rect">
+                      <a:avLst/>
+                    </a:prstGeom>
+                  </pic:spPr>
+                </pic:pic>
+              </a:graphicData>
+            </a:graphic>
+          </wp:inline>
+        </w:drawing>
+      </w:r>
     </w:p>
     <w:sectPr>
       <w:pgSz w:w="12240" w:h="15840"/>
@@ -7088,6 +7442,7 @@
   <w:style w:type="character" w:default="1" w:styleId="DefaultParagraphFont">
     <w:name w:val="Default Paragraph Font"/>
     <w:uiPriority w:val="1"/>
+    <w:semiHidden/>
     <w:unhideWhenUsed/>
   </w:style>
   <w:style w:type="table" w:default="1" w:styleId="TableNormal">

</xml_diff>